<commit_message>
Fix paragraph spacing: set document default to zero
</commit_message>
<xml_diff>
--- a/Basic4_Test3_Reinforcement.docx
+++ b/Basic4_Test3_Reinforcement.docx
@@ -4322,7 +4322,11 @@
         <w:szCs w:val="22"/>
       </w:rPr>
     </w:rPrDefault>
-    <w:pPrDefault/>
+    <w:pPrDefault>
+      <w:pPr>
+        <w:spacing w:after="0" w:before="0" w:line="240" w:lineRule="auto"/>
+      </w:pPr>
+    </w:pPrDefault>
   </w:docDefaults>
   <w:style w:type="paragraph" w:styleId="Title">
     <w:name w:val="Title"/>

</xml_diff>